<commit_message>
Add Week 3 hypothesis testing results and report
</commit_message>
<xml_diff>
--- a/Week3-Statistical-Analysis-Hypothesis-Testing/Week3_Statistical_Analysis_Hypothesis_Testing_Report.docx
+++ b/Week3-Statistical-Analysis-Hypothesis-Testing/Week3_Statistical_Analysis_Hypothesis_Testing_Report.docx
@@ -338,16 +338,16 @@
       </w:r>
     </w:p>
     <w:p>
+      <w:r>
+        <w:br w:type="page"/>
+      </w:r>
+    </w:p>
+    <w:p>
       <w:pPr>
         <w:pStyle w:val="Heading1"/>
       </w:pPr>
       <w:r>
         <w:t>5. Visualizations and Interpretation</w:t>
-      </w:r>
-    </w:p>
-    <w:p>
-      <w:r>
-        <w:br w:type="page"/>
       </w:r>
     </w:p>
     <w:p>
@@ -489,11 +489,6 @@
       </w:r>
     </w:p>
     <w:p>
-      <w:r>
-        <w:br w:type="page"/>
-      </w:r>
-    </w:p>
-    <w:p>
       <w:pPr>
         <w:pStyle w:val="Heading2"/>
       </w:pPr>
@@ -629,11 +624,6 @@
       </w:r>
       <w:r>
         <w:t>Q-Q plots examine departures from a normal reference and make the rationale for adding a non-parametric sensitivity test explicit.</w:t>
-      </w:r>
-    </w:p>
-    <w:p>
-      <w:r>
-        <w:br w:type="page"/>
       </w:r>
     </w:p>
     <w:p>

</xml_diff>